<commit_message>
New games: GTA, wipeout, prison escape, space invader (3D explorer), diver WIP
</commit_message>
<xml_diff>
--- a/Brainstorming/CV/CPIR/Dossier_CPIR_Creation_Entreprise_IA_Etienne_Millerioux.docx
+++ b/Brainstorming/CV/CPIR/Dossier_CPIR_Creation_Entreprise_IA_Etienne_Millerioux.docx
@@ -178,23 +178,6 @@
     <w:p>
       <w:pPr>
         <w:pStyle w:val="Normal"/>
-        <w:rPr>
-          <w:rFonts w:ascii="Calibri" w:hAnsi="Calibri"/>
-        </w:rPr>
-      </w:pPr>
-      <w:r>
-        <w:rPr>
-          <w:rFonts w:ascii="Calibri" w:hAnsi="Calibri"/>
-        </w:rPr>
-      </w:r>
-      <w:r>
-        <w:br w:type="page"/>
-      </w:r>
-    </w:p>
-    <w:p>
-      <w:pPr>
-        <w:pStyle w:val="Heading1"/>
-        <w:spacing w:before="0" w:after="200"/>
         <w:rPr>
           <w:rFonts w:ascii="Calibri" w:hAnsi="Calibri"/>
         </w:rPr>
@@ -837,7 +820,7 @@
         <w:pStyle w:val="BodyText"/>
         <w:numPr>
           <w:ilvl w:val="0"/>
-          <w:numId w:val="2"/>
+          <w:numId w:val="1"/>
         </w:numPr>
         <w:tabs>
           <w:tab w:val="clear" w:pos="720"/>
@@ -868,7 +851,7 @@
         <w:pStyle w:val="BodyText"/>
         <w:numPr>
           <w:ilvl w:val="0"/>
-          <w:numId w:val="2"/>
+          <w:numId w:val="1"/>
         </w:numPr>
         <w:tabs>
           <w:tab w:val="clear" w:pos="720"/>
@@ -899,7 +882,7 @@
         <w:pStyle w:val="BodyText"/>
         <w:numPr>
           <w:ilvl w:val="0"/>
-          <w:numId w:val="2"/>
+          <w:numId w:val="1"/>
         </w:numPr>
         <w:tabs>
           <w:tab w:val="clear" w:pos="720"/>
@@ -1670,8 +1653,8 @@
         </w:tblCellMar>
       </w:tblPr>
       <w:tblGrid>
-        <w:gridCol w:w="3198"/>
-        <w:gridCol w:w="1500"/>
+        <w:gridCol w:w="3197"/>
+        <w:gridCol w:w="1501"/>
         <w:gridCol w:w="4328"/>
       </w:tblGrid>
       <w:tr>
@@ -1680,7 +1663,7 @@
         </w:trPr>
         <w:tc>
           <w:tcPr>
-            <w:tcW w:w="3198" w:type="dxa"/>
+            <w:tcW w:w="3197" w:type="dxa"/>
             <w:tcBorders>
               <w:top w:val="single" w:sz="2" w:space="0" w:color="BBBBBB"/>
               <w:start w:val="single" w:sz="2" w:space="0" w:color="BBBBBB"/>
@@ -1710,7 +1693,7 @@
         </w:tc>
         <w:tc>
           <w:tcPr>
-            <w:tcW w:w="1500" w:type="dxa"/>
+            <w:tcW w:w="1501" w:type="dxa"/>
             <w:tcBorders>
               <w:top w:val="single" w:sz="2" w:space="0" w:color="BBBBBB"/>
               <w:start w:val="single" w:sz="2" w:space="0" w:color="BBBBBB"/>
@@ -1773,7 +1756,7 @@
         <w:trPr/>
         <w:tc>
           <w:tcPr>
-            <w:tcW w:w="3198" w:type="dxa"/>
+            <w:tcW w:w="3197" w:type="dxa"/>
             <w:tcBorders>
               <w:top w:val="single" w:sz="2" w:space="0" w:color="BBBBBB"/>
               <w:start w:val="single" w:sz="2" w:space="0" w:color="BBBBBB"/>
@@ -1800,7 +1783,7 @@
         </w:tc>
         <w:tc>
           <w:tcPr>
-            <w:tcW w:w="1500" w:type="dxa"/>
+            <w:tcW w:w="1501" w:type="dxa"/>
             <w:tcBorders>
               <w:top w:val="single" w:sz="2" w:space="0" w:color="BBBBBB"/>
               <w:start w:val="single" w:sz="2" w:space="0" w:color="BBBBBB"/>
@@ -1857,7 +1840,7 @@
         <w:trPr/>
         <w:tc>
           <w:tcPr>
-            <w:tcW w:w="3198" w:type="dxa"/>
+            <w:tcW w:w="3197" w:type="dxa"/>
             <w:tcBorders>
               <w:top w:val="single" w:sz="2" w:space="0" w:color="BBBBBB"/>
               <w:start w:val="single" w:sz="2" w:space="0" w:color="BBBBBB"/>
@@ -1884,7 +1867,7 @@
         </w:tc>
         <w:tc>
           <w:tcPr>
-            <w:tcW w:w="1500" w:type="dxa"/>
+            <w:tcW w:w="1501" w:type="dxa"/>
             <w:tcBorders>
               <w:top w:val="single" w:sz="2" w:space="0" w:color="BBBBBB"/>
               <w:start w:val="single" w:sz="2" w:space="0" w:color="BBBBBB"/>
@@ -1941,7 +1924,7 @@
         <w:trPr/>
         <w:tc>
           <w:tcPr>
-            <w:tcW w:w="3198" w:type="dxa"/>
+            <w:tcW w:w="3197" w:type="dxa"/>
             <w:tcBorders>
               <w:top w:val="single" w:sz="2" w:space="0" w:color="BBBBBB"/>
               <w:start w:val="single" w:sz="2" w:space="0" w:color="BBBBBB"/>
@@ -1968,7 +1951,7 @@
         </w:tc>
         <w:tc>
           <w:tcPr>
-            <w:tcW w:w="1500" w:type="dxa"/>
+            <w:tcW w:w="1501" w:type="dxa"/>
             <w:tcBorders>
               <w:top w:val="single" w:sz="2" w:space="0" w:color="BBBBBB"/>
               <w:start w:val="single" w:sz="2" w:space="0" w:color="BBBBBB"/>
@@ -2873,9 +2856,9 @@
         </w:tblCellMar>
       </w:tblPr>
       <w:tblGrid>
-        <w:gridCol w:w="2198"/>
+        <w:gridCol w:w="2197"/>
         <w:gridCol w:w="2400"/>
-        <w:gridCol w:w="2202"/>
+        <w:gridCol w:w="2203"/>
         <w:gridCol w:w="2226"/>
       </w:tblGrid>
       <w:tr>
@@ -2884,7 +2867,7 @@
         </w:trPr>
         <w:tc>
           <w:tcPr>
-            <w:tcW w:w="2198" w:type="dxa"/>
+            <w:tcW w:w="2197" w:type="dxa"/>
             <w:tcBorders>
               <w:top w:val="single" w:sz="2" w:space="0" w:color="BBBBBB"/>
               <w:start w:val="single" w:sz="2" w:space="0" w:color="BBBBBB"/>
@@ -2944,7 +2927,7 @@
         </w:tc>
         <w:tc>
           <w:tcPr>
-            <w:tcW w:w="2202" w:type="dxa"/>
+            <w:tcW w:w="2203" w:type="dxa"/>
             <w:tcBorders>
               <w:top w:val="single" w:sz="2" w:space="0" w:color="BBBBBB"/>
               <w:start w:val="single" w:sz="2" w:space="0" w:color="BBBBBB"/>
@@ -3007,7 +2990,7 @@
         <w:trPr/>
         <w:tc>
           <w:tcPr>
-            <w:tcW w:w="2198" w:type="dxa"/>
+            <w:tcW w:w="2197" w:type="dxa"/>
             <w:tcBorders>
               <w:top w:val="single" w:sz="2" w:space="0" w:color="BBBBBB"/>
               <w:start w:val="single" w:sz="2" w:space="0" w:color="BBBBBB"/>
@@ -3061,7 +3044,7 @@
         </w:tc>
         <w:tc>
           <w:tcPr>
-            <w:tcW w:w="2202" w:type="dxa"/>
+            <w:tcW w:w="2203" w:type="dxa"/>
             <w:tcBorders>
               <w:top w:val="single" w:sz="2" w:space="0" w:color="BBBBBB"/>
               <w:start w:val="single" w:sz="2" w:space="0" w:color="BBBBBB"/>
@@ -3118,7 +3101,7 @@
         <w:trPr/>
         <w:tc>
           <w:tcPr>
-            <w:tcW w:w="2198" w:type="dxa"/>
+            <w:tcW w:w="2197" w:type="dxa"/>
             <w:tcBorders>
               <w:top w:val="single" w:sz="2" w:space="0" w:color="BBBBBB"/>
               <w:start w:val="single" w:sz="2" w:space="0" w:color="BBBBBB"/>
@@ -3172,7 +3155,7 @@
         </w:tc>
         <w:tc>
           <w:tcPr>
-            <w:tcW w:w="2202" w:type="dxa"/>
+            <w:tcW w:w="2203" w:type="dxa"/>
             <w:tcBorders>
               <w:top w:val="single" w:sz="2" w:space="0" w:color="BBBBBB"/>
               <w:start w:val="single" w:sz="2" w:space="0" w:color="BBBBBB"/>
@@ -3229,7 +3212,7 @@
         <w:trPr/>
         <w:tc>
           <w:tcPr>
-            <w:tcW w:w="2198" w:type="dxa"/>
+            <w:tcW w:w="2197" w:type="dxa"/>
             <w:tcBorders>
               <w:top w:val="single" w:sz="2" w:space="0" w:color="BBBBBB"/>
               <w:start w:val="single" w:sz="2" w:space="0" w:color="BBBBBB"/>
@@ -3283,7 +3266,7 @@
         </w:tc>
         <w:tc>
           <w:tcPr>
-            <w:tcW w:w="2202" w:type="dxa"/>
+            <w:tcW w:w="2203" w:type="dxa"/>
             <w:tcBorders>
               <w:top w:val="single" w:sz="2" w:space="0" w:color="BBBBBB"/>
               <w:start w:val="single" w:sz="2" w:space="0" w:color="BBBBBB"/>
@@ -3412,11 +3395,11 @@
         </w:tblCellMar>
       </w:tblPr>
       <w:tblGrid>
-        <w:gridCol w:w="1698"/>
-        <w:gridCol w:w="1702"/>
+        <w:gridCol w:w="1697"/>
+        <w:gridCol w:w="1703"/>
         <w:gridCol w:w="2400"/>
-        <w:gridCol w:w="2198"/>
-        <w:gridCol w:w="1028"/>
+        <w:gridCol w:w="2197"/>
+        <w:gridCol w:w="1029"/>
       </w:tblGrid>
       <w:tr>
         <w:trPr>
@@ -3424,7 +3407,7 @@
         </w:trPr>
         <w:tc>
           <w:tcPr>
-            <w:tcW w:w="1698" w:type="dxa"/>
+            <w:tcW w:w="1697" w:type="dxa"/>
             <w:tcBorders>
               <w:top w:val="single" w:sz="2" w:space="0" w:color="BBBBBB"/>
               <w:start w:val="single" w:sz="2" w:space="0" w:color="BBBBBB"/>
@@ -3454,7 +3437,7 @@
         </w:tc>
         <w:tc>
           <w:tcPr>
-            <w:tcW w:w="1702" w:type="dxa"/>
+            <w:tcW w:w="1703" w:type="dxa"/>
             <w:tcBorders>
               <w:top w:val="single" w:sz="2" w:space="0" w:color="BBBBBB"/>
               <w:start w:val="single" w:sz="2" w:space="0" w:color="BBBBBB"/>
@@ -3514,7 +3497,7 @@
         </w:tc>
         <w:tc>
           <w:tcPr>
-            <w:tcW w:w="2198" w:type="dxa"/>
+            <w:tcW w:w="2197" w:type="dxa"/>
             <w:tcBorders>
               <w:top w:val="single" w:sz="2" w:space="0" w:color="BBBBBB"/>
               <w:start w:val="single" w:sz="2" w:space="0" w:color="BBBBBB"/>
@@ -3544,7 +3527,7 @@
         </w:tc>
         <w:tc>
           <w:tcPr>
-            <w:tcW w:w="1028" w:type="dxa"/>
+            <w:tcW w:w="1029" w:type="dxa"/>
             <w:tcBorders>
               <w:top w:val="single" w:sz="2" w:space="0" w:color="BBBBBB"/>
               <w:start w:val="single" w:sz="2" w:space="0" w:color="BBBBBB"/>
@@ -3577,7 +3560,7 @@
         <w:trPr/>
         <w:tc>
           <w:tcPr>
-            <w:tcW w:w="1698" w:type="dxa"/>
+            <w:tcW w:w="1697" w:type="dxa"/>
             <w:tcBorders>
               <w:top w:val="single" w:sz="2" w:space="0" w:color="BBBBBB"/>
               <w:start w:val="single" w:sz="2" w:space="0" w:color="BBBBBB"/>
@@ -3604,7 +3587,7 @@
         </w:tc>
         <w:tc>
           <w:tcPr>
-            <w:tcW w:w="1702" w:type="dxa"/>
+            <w:tcW w:w="1703" w:type="dxa"/>
             <w:tcBorders>
               <w:top w:val="single" w:sz="2" w:space="0" w:color="BBBBBB"/>
               <w:start w:val="single" w:sz="2" w:space="0" w:color="BBBBBB"/>
@@ -3658,7 +3641,7 @@
         </w:tc>
         <w:tc>
           <w:tcPr>
-            <w:tcW w:w="2198" w:type="dxa"/>
+            <w:tcW w:w="2197" w:type="dxa"/>
             <w:tcBorders>
               <w:top w:val="single" w:sz="2" w:space="0" w:color="BBBBBB"/>
               <w:start w:val="single" w:sz="2" w:space="0" w:color="BBBBBB"/>
@@ -3685,7 +3668,7 @@
         </w:tc>
         <w:tc>
           <w:tcPr>
-            <w:tcW w:w="1028" w:type="dxa"/>
+            <w:tcW w:w="1029" w:type="dxa"/>
             <w:tcBorders>
               <w:top w:val="single" w:sz="2" w:space="0" w:color="BBBBBB"/>
               <w:start w:val="single" w:sz="2" w:space="0" w:color="BBBBBB"/>
@@ -3723,7 +3706,7 @@
         <w:trPr/>
         <w:tc>
           <w:tcPr>
-            <w:tcW w:w="1698" w:type="dxa"/>
+            <w:tcW w:w="1697" w:type="dxa"/>
             <w:tcBorders>
               <w:top w:val="single" w:sz="2" w:space="0" w:color="BBBBBB"/>
               <w:start w:val="single" w:sz="2" w:space="0" w:color="BBBBBB"/>
@@ -3750,7 +3733,7 @@
         </w:tc>
         <w:tc>
           <w:tcPr>
-            <w:tcW w:w="1702" w:type="dxa"/>
+            <w:tcW w:w="1703" w:type="dxa"/>
             <w:tcBorders>
               <w:top w:val="single" w:sz="2" w:space="0" w:color="BBBBBB"/>
               <w:start w:val="single" w:sz="2" w:space="0" w:color="BBBBBB"/>
@@ -3804,7 +3787,7 @@
         </w:tc>
         <w:tc>
           <w:tcPr>
-            <w:tcW w:w="2198" w:type="dxa"/>
+            <w:tcW w:w="2197" w:type="dxa"/>
             <w:tcBorders>
               <w:top w:val="single" w:sz="2" w:space="0" w:color="BBBBBB"/>
               <w:start w:val="single" w:sz="2" w:space="0" w:color="BBBBBB"/>
@@ -3831,7 +3814,7 @@
         </w:tc>
         <w:tc>
           <w:tcPr>
-            <w:tcW w:w="1028" w:type="dxa"/>
+            <w:tcW w:w="1029" w:type="dxa"/>
             <w:tcBorders>
               <w:top w:val="single" w:sz="2" w:space="0" w:color="BBBBBB"/>
               <w:start w:val="single" w:sz="2" w:space="0" w:color="BBBBBB"/>
@@ -3869,7 +3852,7 @@
         <w:trPr/>
         <w:tc>
           <w:tcPr>
-            <w:tcW w:w="1698" w:type="dxa"/>
+            <w:tcW w:w="1697" w:type="dxa"/>
             <w:tcBorders>
               <w:top w:val="single" w:sz="2" w:space="0" w:color="BBBBBB"/>
               <w:start w:val="single" w:sz="2" w:space="0" w:color="BBBBBB"/>
@@ -3896,7 +3879,7 @@
         </w:tc>
         <w:tc>
           <w:tcPr>
-            <w:tcW w:w="1702" w:type="dxa"/>
+            <w:tcW w:w="1703" w:type="dxa"/>
             <w:tcBorders>
               <w:top w:val="single" w:sz="2" w:space="0" w:color="BBBBBB"/>
               <w:start w:val="single" w:sz="2" w:space="0" w:color="BBBBBB"/>
@@ -3950,7 +3933,7 @@
         </w:tc>
         <w:tc>
           <w:tcPr>
-            <w:tcW w:w="2198" w:type="dxa"/>
+            <w:tcW w:w="2197" w:type="dxa"/>
             <w:tcBorders>
               <w:top w:val="single" w:sz="2" w:space="0" w:color="BBBBBB"/>
               <w:start w:val="single" w:sz="2" w:space="0" w:color="BBBBBB"/>
@@ -3977,7 +3960,7 @@
         </w:tc>
         <w:tc>
           <w:tcPr>
-            <w:tcW w:w="1028" w:type="dxa"/>
+            <w:tcW w:w="1029" w:type="dxa"/>
             <w:tcBorders>
               <w:top w:val="single" w:sz="2" w:space="0" w:color="BBBBBB"/>
               <w:start w:val="single" w:sz="2" w:space="0" w:color="BBBBBB"/>
@@ -5095,9 +5078,9 @@
         </w:tblCellMar>
       </w:tblPr>
       <w:tblGrid>
-        <w:gridCol w:w="2198"/>
+        <w:gridCol w:w="2197"/>
         <w:gridCol w:w="2400"/>
-        <w:gridCol w:w="4428"/>
+        <w:gridCol w:w="4429"/>
       </w:tblGrid>
       <w:tr>
         <w:trPr>
@@ -5105,7 +5088,7 @@
         </w:trPr>
         <w:tc>
           <w:tcPr>
-            <w:tcW w:w="2198" w:type="dxa"/>
+            <w:tcW w:w="2197" w:type="dxa"/>
             <w:tcBorders>
               <w:top w:val="single" w:sz="2" w:space="0" w:color="BBBBBB"/>
               <w:start w:val="single" w:sz="2" w:space="0" w:color="BBBBBB"/>
@@ -5165,7 +5148,7 @@
         </w:tc>
         <w:tc>
           <w:tcPr>
-            <w:tcW w:w="4428" w:type="dxa"/>
+            <w:tcW w:w="4429" w:type="dxa"/>
             <w:tcBorders>
               <w:top w:val="single" w:sz="2" w:space="0" w:color="BBBBBB"/>
               <w:start w:val="single" w:sz="2" w:space="0" w:color="BBBBBB"/>
@@ -5198,7 +5181,7 @@
         <w:trPr/>
         <w:tc>
           <w:tcPr>
-            <w:tcW w:w="2198" w:type="dxa"/>
+            <w:tcW w:w="2197" w:type="dxa"/>
             <w:tcBorders>
               <w:top w:val="single" w:sz="2" w:space="0" w:color="BBBBBB"/>
               <w:start w:val="single" w:sz="2" w:space="0" w:color="BBBBBB"/>
@@ -5252,7 +5235,7 @@
         </w:tc>
         <w:tc>
           <w:tcPr>
-            <w:tcW w:w="4428" w:type="dxa"/>
+            <w:tcW w:w="4429" w:type="dxa"/>
             <w:tcBorders>
               <w:top w:val="single" w:sz="2" w:space="0" w:color="BBBBBB"/>
               <w:start w:val="single" w:sz="2" w:space="0" w:color="BBBBBB"/>
@@ -5282,7 +5265,7 @@
         <w:trPr/>
         <w:tc>
           <w:tcPr>
-            <w:tcW w:w="2198" w:type="dxa"/>
+            <w:tcW w:w="2197" w:type="dxa"/>
             <w:tcBorders>
               <w:top w:val="single" w:sz="2" w:space="0" w:color="BBBBBB"/>
               <w:start w:val="single" w:sz="2" w:space="0" w:color="BBBBBB"/>
@@ -5336,7 +5319,7 @@
         </w:tc>
         <w:tc>
           <w:tcPr>
-            <w:tcW w:w="4428" w:type="dxa"/>
+            <w:tcW w:w="4429" w:type="dxa"/>
             <w:tcBorders>
               <w:top w:val="single" w:sz="2" w:space="0" w:color="BBBBBB"/>
               <w:start w:val="single" w:sz="2" w:space="0" w:color="BBBBBB"/>
@@ -5366,7 +5349,7 @@
         <w:trPr/>
         <w:tc>
           <w:tcPr>
-            <w:tcW w:w="2198" w:type="dxa"/>
+            <w:tcW w:w="2197" w:type="dxa"/>
             <w:tcBorders>
               <w:top w:val="single" w:sz="2" w:space="0" w:color="BBBBBB"/>
               <w:start w:val="single" w:sz="2" w:space="0" w:color="BBBBBB"/>
@@ -5420,7 +5403,7 @@
         </w:tc>
         <w:tc>
           <w:tcPr>
-            <w:tcW w:w="4428" w:type="dxa"/>
+            <w:tcW w:w="4429" w:type="dxa"/>
             <w:tcBorders>
               <w:top w:val="single" w:sz="2" w:space="0" w:color="BBBBBB"/>
               <w:start w:val="single" w:sz="2" w:space="0" w:color="BBBBBB"/>
@@ -5450,7 +5433,7 @@
         <w:trPr/>
         <w:tc>
           <w:tcPr>
-            <w:tcW w:w="2198" w:type="dxa"/>
+            <w:tcW w:w="2197" w:type="dxa"/>
             <w:tcBorders>
               <w:top w:val="single" w:sz="2" w:space="0" w:color="BBBBBB"/>
               <w:start w:val="single" w:sz="2" w:space="0" w:color="BBBBBB"/>
@@ -5504,7 +5487,7 @@
         </w:tc>
         <w:tc>
           <w:tcPr>
-            <w:tcW w:w="4428" w:type="dxa"/>
+            <w:tcW w:w="4429" w:type="dxa"/>
             <w:tcBorders>
               <w:top w:val="single" w:sz="2" w:space="0" w:color="BBBBBB"/>
               <w:start w:val="single" w:sz="2" w:space="0" w:color="BBBBBB"/>
@@ -5534,7 +5517,7 @@
         <w:trPr/>
         <w:tc>
           <w:tcPr>
-            <w:tcW w:w="2198" w:type="dxa"/>
+            <w:tcW w:w="2197" w:type="dxa"/>
             <w:tcBorders>
               <w:top w:val="single" w:sz="2" w:space="0" w:color="BBBBBB"/>
               <w:start w:val="single" w:sz="2" w:space="0" w:color="BBBBBB"/>
@@ -5588,7 +5571,7 @@
         </w:tc>
         <w:tc>
           <w:tcPr>
-            <w:tcW w:w="4428" w:type="dxa"/>
+            <w:tcW w:w="4429" w:type="dxa"/>
             <w:tcBorders>
               <w:top w:val="single" w:sz="2" w:space="0" w:color="BBBBBB"/>
               <w:start w:val="single" w:sz="2" w:space="0" w:color="BBBBBB"/>
@@ -5618,7 +5601,7 @@
         <w:trPr/>
         <w:tc>
           <w:tcPr>
-            <w:tcW w:w="2198" w:type="dxa"/>
+            <w:tcW w:w="2197" w:type="dxa"/>
             <w:tcBorders>
               <w:top w:val="single" w:sz="2" w:space="0" w:color="BBBBBB"/>
               <w:start w:val="single" w:sz="2" w:space="0" w:color="BBBBBB"/>
@@ -5672,7 +5655,7 @@
         </w:tc>
         <w:tc>
           <w:tcPr>
-            <w:tcW w:w="4428" w:type="dxa"/>
+            <w:tcW w:w="4429" w:type="dxa"/>
             <w:tcBorders>
               <w:top w:val="single" w:sz="2" w:space="0" w:color="BBBBBB"/>
               <w:start w:val="single" w:sz="2" w:space="0" w:color="BBBBBB"/>
@@ -5702,7 +5685,7 @@
         <w:trPr/>
         <w:tc>
           <w:tcPr>
-            <w:tcW w:w="2198" w:type="dxa"/>
+            <w:tcW w:w="2197" w:type="dxa"/>
             <w:tcBorders>
               <w:top w:val="single" w:sz="2" w:space="0" w:color="BBBBBB"/>
               <w:start w:val="single" w:sz="2" w:space="0" w:color="BBBBBB"/>
@@ -5756,7 +5739,7 @@
         </w:tc>
         <w:tc>
           <w:tcPr>
-            <w:tcW w:w="4428" w:type="dxa"/>
+            <w:tcW w:w="4429" w:type="dxa"/>
             <w:tcBorders>
               <w:top w:val="single" w:sz="2" w:space="0" w:color="BBBBBB"/>
               <w:start w:val="single" w:sz="2" w:space="0" w:color="BBBBBB"/>
@@ -5786,7 +5769,7 @@
         <w:trPr/>
         <w:tc>
           <w:tcPr>
-            <w:tcW w:w="2198" w:type="dxa"/>
+            <w:tcW w:w="2197" w:type="dxa"/>
             <w:tcBorders>
               <w:top w:val="single" w:sz="2" w:space="0" w:color="BBBBBB"/>
               <w:start w:val="single" w:sz="2" w:space="0" w:color="BBBBBB"/>
@@ -5840,7 +5823,7 @@
         </w:tc>
         <w:tc>
           <w:tcPr>
-            <w:tcW w:w="4428" w:type="dxa"/>
+            <w:tcW w:w="4429" w:type="dxa"/>
             <w:tcBorders>
               <w:top w:val="single" w:sz="2" w:space="0" w:color="BBBBBB"/>
               <w:start w:val="single" w:sz="2" w:space="0" w:color="BBBBBB"/>
@@ -5870,7 +5853,7 @@
         <w:trPr/>
         <w:tc>
           <w:tcPr>
-            <w:tcW w:w="2198" w:type="dxa"/>
+            <w:tcW w:w="2197" w:type="dxa"/>
             <w:tcBorders>
               <w:top w:val="single" w:sz="2" w:space="0" w:color="BBBBBB"/>
               <w:start w:val="single" w:sz="2" w:space="0" w:color="BBBBBB"/>
@@ -5924,7 +5907,7 @@
         </w:tc>
         <w:tc>
           <w:tcPr>
-            <w:tcW w:w="4428" w:type="dxa"/>
+            <w:tcW w:w="4429" w:type="dxa"/>
             <w:tcBorders>
               <w:top w:val="single" w:sz="2" w:space="0" w:color="BBBBBB"/>
               <w:start w:val="single" w:sz="2" w:space="0" w:color="BBBBBB"/>
@@ -6195,8 +6178,8 @@
         </w:tblCellMar>
       </w:tblPr>
       <w:tblGrid>
-        <w:gridCol w:w="2698"/>
-        <w:gridCol w:w="1302"/>
+        <w:gridCol w:w="2697"/>
+        <w:gridCol w:w="1303"/>
         <w:gridCol w:w="5026"/>
       </w:tblGrid>
       <w:tr>
@@ -6205,7 +6188,7 @@
         </w:trPr>
         <w:tc>
           <w:tcPr>
-            <w:tcW w:w="2698" w:type="dxa"/>
+            <w:tcW w:w="2697" w:type="dxa"/>
             <w:tcBorders>
               <w:top w:val="single" w:sz="2" w:space="0" w:color="BBBBBB"/>
               <w:start w:val="single" w:sz="2" w:space="0" w:color="BBBBBB"/>
@@ -6235,7 +6218,7 @@
         </w:tc>
         <w:tc>
           <w:tcPr>
-            <w:tcW w:w="1302" w:type="dxa"/>
+            <w:tcW w:w="1303" w:type="dxa"/>
             <w:tcBorders>
               <w:top w:val="single" w:sz="2" w:space="0" w:color="BBBBBB"/>
               <w:start w:val="single" w:sz="2" w:space="0" w:color="BBBBBB"/>
@@ -6298,7 +6281,7 @@
         <w:trPr/>
         <w:tc>
           <w:tcPr>
-            <w:tcW w:w="2698" w:type="dxa"/>
+            <w:tcW w:w="2697" w:type="dxa"/>
             <w:tcBorders>
               <w:top w:val="single" w:sz="2" w:space="0" w:color="BBBBBB"/>
               <w:start w:val="single" w:sz="2" w:space="0" w:color="BBBBBB"/>
@@ -6325,7 +6308,7 @@
         </w:tc>
         <w:tc>
           <w:tcPr>
-            <w:tcW w:w="1302" w:type="dxa"/>
+            <w:tcW w:w="1303" w:type="dxa"/>
             <w:tcBorders>
               <w:top w:val="single" w:sz="2" w:space="0" w:color="BBBBBB"/>
               <w:start w:val="single" w:sz="2" w:space="0" w:color="BBBBBB"/>
@@ -6382,7 +6365,7 @@
         <w:trPr/>
         <w:tc>
           <w:tcPr>
-            <w:tcW w:w="2698" w:type="dxa"/>
+            <w:tcW w:w="2697" w:type="dxa"/>
             <w:tcBorders>
               <w:top w:val="single" w:sz="2" w:space="0" w:color="BBBBBB"/>
               <w:start w:val="single" w:sz="2" w:space="0" w:color="BBBBBB"/>
@@ -6409,7 +6392,7 @@
         </w:tc>
         <w:tc>
           <w:tcPr>
-            <w:tcW w:w="1302" w:type="dxa"/>
+            <w:tcW w:w="1303" w:type="dxa"/>
             <w:tcBorders>
               <w:top w:val="single" w:sz="2" w:space="0" w:color="BBBBBB"/>
               <w:start w:val="single" w:sz="2" w:space="0" w:color="BBBBBB"/>
@@ -6466,7 +6449,7 @@
         <w:trPr/>
         <w:tc>
           <w:tcPr>
-            <w:tcW w:w="2698" w:type="dxa"/>
+            <w:tcW w:w="2697" w:type="dxa"/>
             <w:tcBorders>
               <w:top w:val="single" w:sz="2" w:space="0" w:color="BBBBBB"/>
               <w:start w:val="single" w:sz="2" w:space="0" w:color="BBBBBB"/>
@@ -6493,7 +6476,7 @@
         </w:tc>
         <w:tc>
           <w:tcPr>
-            <w:tcW w:w="1302" w:type="dxa"/>
+            <w:tcW w:w="1303" w:type="dxa"/>
             <w:tcBorders>
               <w:top w:val="single" w:sz="2" w:space="0" w:color="BBBBBB"/>
               <w:start w:val="single" w:sz="2" w:space="0" w:color="BBBBBB"/>
@@ -6550,7 +6533,7 @@
         <w:trPr/>
         <w:tc>
           <w:tcPr>
-            <w:tcW w:w="2698" w:type="dxa"/>
+            <w:tcW w:w="2697" w:type="dxa"/>
             <w:tcBorders>
               <w:top w:val="single" w:sz="2" w:space="0" w:color="BBBBBB"/>
               <w:start w:val="single" w:sz="2" w:space="0" w:color="BBBBBB"/>
@@ -6577,7 +6560,7 @@
         </w:tc>
         <w:tc>
           <w:tcPr>
-            <w:tcW w:w="1302" w:type="dxa"/>
+            <w:tcW w:w="1303" w:type="dxa"/>
             <w:tcBorders>
               <w:top w:val="single" w:sz="2" w:space="0" w:color="BBBBBB"/>
               <w:start w:val="single" w:sz="2" w:space="0" w:color="BBBBBB"/>
@@ -6634,7 +6617,7 @@
         <w:trPr/>
         <w:tc>
           <w:tcPr>
-            <w:tcW w:w="2698" w:type="dxa"/>
+            <w:tcW w:w="2697" w:type="dxa"/>
             <w:tcBorders>
               <w:top w:val="single" w:sz="2" w:space="0" w:color="BBBBBB"/>
               <w:start w:val="single" w:sz="2" w:space="0" w:color="BBBBBB"/>
@@ -6661,7 +6644,7 @@
         </w:tc>
         <w:tc>
           <w:tcPr>
-            <w:tcW w:w="1302" w:type="dxa"/>
+            <w:tcW w:w="1303" w:type="dxa"/>
             <w:tcBorders>
               <w:top w:val="single" w:sz="2" w:space="0" w:color="BBBBBB"/>
               <w:start w:val="single" w:sz="2" w:space="0" w:color="BBBBBB"/>
@@ -6718,7 +6701,7 @@
         <w:trPr/>
         <w:tc>
           <w:tcPr>
-            <w:tcW w:w="2698" w:type="dxa"/>
+            <w:tcW w:w="2697" w:type="dxa"/>
             <w:tcBorders>
               <w:top w:val="single" w:sz="2" w:space="0" w:color="BBBBBB"/>
               <w:start w:val="single" w:sz="2" w:space="0" w:color="BBBBBB"/>
@@ -6745,7 +6728,7 @@
         </w:tc>
         <w:tc>
           <w:tcPr>
-            <w:tcW w:w="1302" w:type="dxa"/>
+            <w:tcW w:w="1303" w:type="dxa"/>
             <w:tcBorders>
               <w:top w:val="single" w:sz="2" w:space="0" w:color="BBBBBB"/>
               <w:start w:val="single" w:sz="2" w:space="0" w:color="BBBBBB"/>
@@ -7107,7 +7090,7 @@
     </w:r>
     <w:r>
       <w:rPr/>
-      <w:t>14</w:t>
+      <w:t>13</w:t>
     </w:r>
     <w:r>
       <w:rPr/>
@@ -7147,7 +7130,7 @@
     </w:r>
     <w:r>
       <w:rPr/>
-      <w:t>14</w:t>
+      <w:t>13</w:t>
     </w:r>
     <w:r>
       <w:rPr/>
@@ -7237,6 +7220,143 @@
       <w:lvlJc w:val="start"/>
       <w:pPr>
         <w:tabs>
+          <w:tab w:val="num" w:pos="709"/>
+        </w:tabs>
+        <w:ind w:start="709" w:hanging="283"/>
+      </w:pPr>
+      <w:rPr>
+        <w:rFonts w:ascii="Symbol" w:hAnsi="Symbol" w:cs="Symbol" w:hint="default"/>
+      </w:rPr>
+    </w:lvl>
+    <w:lvl w:ilvl="1">
+      <w:start w:val="1"/>
+      <w:numFmt w:val="bullet"/>
+      <w:lvlText w:val=""/>
+      <w:lvlJc w:val="start"/>
+      <w:pPr>
+        <w:tabs>
+          <w:tab w:val="num" w:pos="1418"/>
+        </w:tabs>
+        <w:ind w:start="1418" w:hanging="283"/>
+      </w:pPr>
+      <w:rPr>
+        <w:rFonts w:ascii="Symbol" w:hAnsi="Symbol" w:cs="Symbol" w:hint="default"/>
+      </w:rPr>
+    </w:lvl>
+    <w:lvl w:ilvl="2">
+      <w:start w:val="1"/>
+      <w:numFmt w:val="bullet"/>
+      <w:lvlText w:val=""/>
+      <w:lvlJc w:val="start"/>
+      <w:pPr>
+        <w:tabs>
+          <w:tab w:val="num" w:pos="2127"/>
+        </w:tabs>
+        <w:ind w:start="2127" w:hanging="283"/>
+      </w:pPr>
+      <w:rPr>
+        <w:rFonts w:ascii="Symbol" w:hAnsi="Symbol" w:cs="Symbol" w:hint="default"/>
+      </w:rPr>
+    </w:lvl>
+    <w:lvl w:ilvl="3">
+      <w:start w:val="1"/>
+      <w:numFmt w:val="bullet"/>
+      <w:lvlText w:val=""/>
+      <w:lvlJc w:val="start"/>
+      <w:pPr>
+        <w:tabs>
+          <w:tab w:val="num" w:pos="2836"/>
+        </w:tabs>
+        <w:ind w:start="2836" w:hanging="283"/>
+      </w:pPr>
+      <w:rPr>
+        <w:rFonts w:ascii="Symbol" w:hAnsi="Symbol" w:cs="Symbol" w:hint="default"/>
+      </w:rPr>
+    </w:lvl>
+    <w:lvl w:ilvl="4">
+      <w:start w:val="1"/>
+      <w:numFmt w:val="bullet"/>
+      <w:lvlText w:val=""/>
+      <w:lvlJc w:val="start"/>
+      <w:pPr>
+        <w:tabs>
+          <w:tab w:val="num" w:pos="3545"/>
+        </w:tabs>
+        <w:ind w:start="3545" w:hanging="283"/>
+      </w:pPr>
+      <w:rPr>
+        <w:rFonts w:ascii="Symbol" w:hAnsi="Symbol" w:cs="Symbol" w:hint="default"/>
+      </w:rPr>
+    </w:lvl>
+    <w:lvl w:ilvl="5">
+      <w:start w:val="1"/>
+      <w:numFmt w:val="bullet"/>
+      <w:lvlText w:val=""/>
+      <w:lvlJc w:val="start"/>
+      <w:pPr>
+        <w:tabs>
+          <w:tab w:val="num" w:pos="4254"/>
+        </w:tabs>
+        <w:ind w:start="4254" w:hanging="283"/>
+      </w:pPr>
+      <w:rPr>
+        <w:rFonts w:ascii="Symbol" w:hAnsi="Symbol" w:cs="Symbol" w:hint="default"/>
+      </w:rPr>
+    </w:lvl>
+    <w:lvl w:ilvl="6">
+      <w:start w:val="1"/>
+      <w:numFmt w:val="bullet"/>
+      <w:lvlText w:val=""/>
+      <w:lvlJc w:val="start"/>
+      <w:pPr>
+        <w:tabs>
+          <w:tab w:val="num" w:pos="4963"/>
+        </w:tabs>
+        <w:ind w:start="4963" w:hanging="283"/>
+      </w:pPr>
+      <w:rPr>
+        <w:rFonts w:ascii="Symbol" w:hAnsi="Symbol" w:cs="Symbol" w:hint="default"/>
+      </w:rPr>
+    </w:lvl>
+    <w:lvl w:ilvl="7">
+      <w:start w:val="1"/>
+      <w:numFmt w:val="bullet"/>
+      <w:lvlText w:val=""/>
+      <w:lvlJc w:val="start"/>
+      <w:pPr>
+        <w:tabs>
+          <w:tab w:val="num" w:pos="5672"/>
+        </w:tabs>
+        <w:ind w:start="5672" w:hanging="283"/>
+      </w:pPr>
+      <w:rPr>
+        <w:rFonts w:ascii="Symbol" w:hAnsi="Symbol" w:cs="Symbol" w:hint="default"/>
+      </w:rPr>
+    </w:lvl>
+    <w:lvl w:ilvl="8">
+      <w:start w:val="1"/>
+      <w:numFmt w:val="bullet"/>
+      <w:lvlText w:val=""/>
+      <w:lvlJc w:val="start"/>
+      <w:pPr>
+        <w:tabs>
+          <w:tab w:val="num" w:pos="6381"/>
+        </w:tabs>
+        <w:ind w:start="6381" w:hanging="283"/>
+      </w:pPr>
+      <w:rPr>
+        <w:rFonts w:ascii="Symbol" w:hAnsi="Symbol" w:cs="Symbol" w:hint="default"/>
+      </w:rPr>
+    </w:lvl>
+  </w:abstractNum>
+  <w:abstractNum w:abstractNumId="2">
+    <w:lvl w:ilvl="0">
+      <w:start w:val="1"/>
+      <w:numFmt w:val="bullet"/>
+      <w:lvlText w:val=""/>
+      <w:lvlJc w:val="start"/>
+      <w:pPr>
+        <w:tabs>
           <w:tab w:val="num" w:pos="0"/>
         </w:tabs>
         <w:ind w:start="540" w:hanging="270"/>
@@ -7348,143 +7468,6 @@
         <w:ind w:start="3600" w:hanging="360"/>
       </w:pPr>
       <w:rPr/>
-    </w:lvl>
-  </w:abstractNum>
-  <w:abstractNum w:abstractNumId="2">
-    <w:lvl w:ilvl="0">
-      <w:start w:val="1"/>
-      <w:numFmt w:val="bullet"/>
-      <w:lvlText w:val=""/>
-      <w:lvlJc w:val="start"/>
-      <w:pPr>
-        <w:tabs>
-          <w:tab w:val="num" w:pos="709"/>
-        </w:tabs>
-        <w:ind w:start="709" w:hanging="283"/>
-      </w:pPr>
-      <w:rPr>
-        <w:rFonts w:ascii="Symbol" w:hAnsi="Symbol" w:cs="Symbol" w:hint="default"/>
-      </w:rPr>
-    </w:lvl>
-    <w:lvl w:ilvl="1">
-      <w:start w:val="1"/>
-      <w:numFmt w:val="bullet"/>
-      <w:lvlText w:val=""/>
-      <w:lvlJc w:val="start"/>
-      <w:pPr>
-        <w:tabs>
-          <w:tab w:val="num" w:pos="1418"/>
-        </w:tabs>
-        <w:ind w:start="1418" w:hanging="283"/>
-      </w:pPr>
-      <w:rPr>
-        <w:rFonts w:ascii="Symbol" w:hAnsi="Symbol" w:cs="Symbol" w:hint="default"/>
-      </w:rPr>
-    </w:lvl>
-    <w:lvl w:ilvl="2">
-      <w:start w:val="1"/>
-      <w:numFmt w:val="bullet"/>
-      <w:lvlText w:val=""/>
-      <w:lvlJc w:val="start"/>
-      <w:pPr>
-        <w:tabs>
-          <w:tab w:val="num" w:pos="2127"/>
-        </w:tabs>
-        <w:ind w:start="2127" w:hanging="283"/>
-      </w:pPr>
-      <w:rPr>
-        <w:rFonts w:ascii="Symbol" w:hAnsi="Symbol" w:cs="Symbol" w:hint="default"/>
-      </w:rPr>
-    </w:lvl>
-    <w:lvl w:ilvl="3">
-      <w:start w:val="1"/>
-      <w:numFmt w:val="bullet"/>
-      <w:lvlText w:val=""/>
-      <w:lvlJc w:val="start"/>
-      <w:pPr>
-        <w:tabs>
-          <w:tab w:val="num" w:pos="2836"/>
-        </w:tabs>
-        <w:ind w:start="2836" w:hanging="283"/>
-      </w:pPr>
-      <w:rPr>
-        <w:rFonts w:ascii="Symbol" w:hAnsi="Symbol" w:cs="Symbol" w:hint="default"/>
-      </w:rPr>
-    </w:lvl>
-    <w:lvl w:ilvl="4">
-      <w:start w:val="1"/>
-      <w:numFmt w:val="bullet"/>
-      <w:lvlText w:val=""/>
-      <w:lvlJc w:val="start"/>
-      <w:pPr>
-        <w:tabs>
-          <w:tab w:val="num" w:pos="3545"/>
-        </w:tabs>
-        <w:ind w:start="3545" w:hanging="283"/>
-      </w:pPr>
-      <w:rPr>
-        <w:rFonts w:ascii="Symbol" w:hAnsi="Symbol" w:cs="Symbol" w:hint="default"/>
-      </w:rPr>
-    </w:lvl>
-    <w:lvl w:ilvl="5">
-      <w:start w:val="1"/>
-      <w:numFmt w:val="bullet"/>
-      <w:lvlText w:val=""/>
-      <w:lvlJc w:val="start"/>
-      <w:pPr>
-        <w:tabs>
-          <w:tab w:val="num" w:pos="4254"/>
-        </w:tabs>
-        <w:ind w:start="4254" w:hanging="283"/>
-      </w:pPr>
-      <w:rPr>
-        <w:rFonts w:ascii="Symbol" w:hAnsi="Symbol" w:cs="Symbol" w:hint="default"/>
-      </w:rPr>
-    </w:lvl>
-    <w:lvl w:ilvl="6">
-      <w:start w:val="1"/>
-      <w:numFmt w:val="bullet"/>
-      <w:lvlText w:val=""/>
-      <w:lvlJc w:val="start"/>
-      <w:pPr>
-        <w:tabs>
-          <w:tab w:val="num" w:pos="4963"/>
-        </w:tabs>
-        <w:ind w:start="4963" w:hanging="283"/>
-      </w:pPr>
-      <w:rPr>
-        <w:rFonts w:ascii="Symbol" w:hAnsi="Symbol" w:cs="Symbol" w:hint="default"/>
-      </w:rPr>
-    </w:lvl>
-    <w:lvl w:ilvl="7">
-      <w:start w:val="1"/>
-      <w:numFmt w:val="bullet"/>
-      <w:lvlText w:val=""/>
-      <w:lvlJc w:val="start"/>
-      <w:pPr>
-        <w:tabs>
-          <w:tab w:val="num" w:pos="5672"/>
-        </w:tabs>
-        <w:ind w:start="5672" w:hanging="283"/>
-      </w:pPr>
-      <w:rPr>
-        <w:rFonts w:ascii="Symbol" w:hAnsi="Symbol" w:cs="Symbol" w:hint="default"/>
-      </w:rPr>
-    </w:lvl>
-    <w:lvl w:ilvl="8">
-      <w:start w:val="1"/>
-      <w:numFmt w:val="bullet"/>
-      <w:lvlText w:val=""/>
-      <w:lvlJc w:val="start"/>
-      <w:pPr>
-        <w:tabs>
-          <w:tab w:val="num" w:pos="6381"/>
-        </w:tabs>
-        <w:ind w:start="6381" w:hanging="283"/>
-      </w:pPr>
-      <w:rPr>
-        <w:rFonts w:ascii="Symbol" w:hAnsi="Symbol" w:cs="Symbol" w:hint="default"/>
-      </w:rPr>
     </w:lvl>
   </w:abstractNum>
   <w:abstractNum w:abstractNumId="3">
@@ -7786,7 +7769,7 @@
   </w:style>
   <w:style w:type="paragraph" w:styleId="Heading1">
     <w:name w:val="heading 1"/>
-    <w:basedOn w:val="Titreuser"/>
+    <w:basedOn w:val="Titre"/>
     <w:qFormat/>
     <w:pPr>
       <w:spacing w:before="280" w:after="200"/>
@@ -7803,7 +7786,7 @@
   </w:style>
   <w:style w:type="paragraph" w:styleId="Heading2">
     <w:name w:val="heading 2"/>
-    <w:basedOn w:val="Titreuser"/>
+    <w:basedOn w:val="Titre"/>
     <w:qFormat/>
     <w:pPr>
       <w:spacing w:before="220" w:after="140"/>
@@ -7820,7 +7803,7 @@
   </w:style>
   <w:style w:type="paragraph" w:styleId="Heading3">
     <w:name w:val="heading 3"/>
-    <w:basedOn w:val="Titreuser"/>
+    <w:basedOn w:val="Titre"/>
     <w:qFormat/>
     <w:pPr>
       <w:spacing w:before="160" w:after="100"/>
@@ -7838,7 +7821,7 @@
   </w:style>
   <w:style w:type="paragraph" w:styleId="Heading4">
     <w:name w:val="heading 4"/>
-    <w:basedOn w:val="Titreuser"/>
+    <w:basedOn w:val="Titre"/>
     <w:qFormat/>
     <w:pPr/>
     <w:rPr>
@@ -7849,7 +7832,7 @@
   </w:style>
   <w:style w:type="paragraph" w:styleId="Heading5">
     <w:name w:val="heading 5"/>
-    <w:basedOn w:val="Titreuser"/>
+    <w:basedOn w:val="Titre"/>
     <w:qFormat/>
     <w:pPr/>
     <w:rPr>
@@ -7858,7 +7841,7 @@
   </w:style>
   <w:style w:type="paragraph" w:styleId="Heading6">
     <w:name w:val="heading 6"/>
-    <w:basedOn w:val="Titreuser"/>
+    <w:basedOn w:val="Titre"/>
     <w:qFormat/>
     <w:pPr/>
     <w:rPr>
@@ -7874,8 +7857,8 @@
       <w:u w:val="single"/>
     </w:rPr>
   </w:style>
-  <w:style w:type="character" w:styleId="Caractresdenotedebasdepageuser">
-    <w:name w:val="Caractères de note de bas de page (user)"/>
+  <w:style w:type="character" w:styleId="Caractresdenotedebasdepage">
+    <w:name w:val="Caractères de note de bas de page"/>
     <w:uiPriority w:val="99"/>
     <w:semiHidden/>
     <w:unhideWhenUsed/>
@@ -7884,8 +7867,8 @@
       <w:vertAlign w:val="superscript"/>
     </w:rPr>
   </w:style>
-  <w:style w:type="character" w:styleId="Caractresdenotedebasdepage">
-    <w:name w:val="Caractères de note de bas de page"/>
+  <w:style w:type="character" w:styleId="Caractresdenotedebasdepageuser">
+    <w:name w:val="Caractères de note de bas de page (user)"/>
     <w:qFormat/>
     <w:rPr>
       <w:vertAlign w:val="superscript"/>
@@ -7908,8 +7891,8 @@
       <w:szCs w:val="20"/>
     </w:rPr>
   </w:style>
-  <w:style w:type="character" w:styleId="Caractresdenotedefinuser">
-    <w:name w:val="Caractères de note de fin (user)"/>
+  <w:style w:type="character" w:styleId="Caractresdenotedefin">
+    <w:name w:val="Caractères de note de fin"/>
     <w:uiPriority w:val="99"/>
     <w:semiHidden/>
     <w:unhideWhenUsed/>
@@ -7918,8 +7901,8 @@
       <w:vertAlign w:val="superscript"/>
     </w:rPr>
   </w:style>
-  <w:style w:type="character" w:styleId="Caractresdenotedefin">
-    <w:name w:val="Caractères de note de fin"/>
+  <w:style w:type="character" w:styleId="Caractresdenotedefinuser">
+    <w:name w:val="Caractères de note de fin (user)"/>
     <w:qFormat/>
     <w:rPr>
       <w:vertAlign w:val="superscript"/>
@@ -7950,8 +7933,8 @@
       <w:bCs/>
     </w:rPr>
   </w:style>
-  <w:style w:type="character" w:styleId="Pucesuser">
-    <w:name w:val="Puces (user)"/>
+  <w:style w:type="character" w:styleId="Puces">
+    <w:name w:val="Puces"/>
     <w:qFormat/>
     <w:rPr>
       <w:rFonts w:ascii="OpenSymbol" w:hAnsi="OpenSymbol" w:eastAsia="OpenSymbol" w:cs="OpenSymbol"/>
@@ -8032,7 +8015,7 @@
   </w:style>
   <w:style w:type="paragraph" w:styleId="Title">
     <w:name w:val="Title"/>
-    <w:basedOn w:val="Titreuser"/>
+    <w:basedOn w:val="Titre"/>
     <w:qFormat/>
     <w:pPr/>
     <w:rPr>
@@ -8110,6 +8093,13 @@
       <w:szCs w:val="20"/>
     </w:rPr>
   </w:style>
+  <w:style w:type="paragraph" w:styleId="En-tteetpieddepage">
+    <w:name w:val="En-tête et pied de page"/>
+    <w:basedOn w:val="Normal"/>
+    <w:qFormat/>
+    <w:pPr/>
+    <w:rPr/>
+  </w:style>
   <w:style w:type="paragraph" w:styleId="En-tteetpieddepageuser">
     <w:name w:val="En-tête et pied de page (user)"/>
     <w:basedOn w:val="Normal"/>
@@ -8117,22 +8107,15 @@
     <w:pPr/>
     <w:rPr/>
   </w:style>
-  <w:style w:type="paragraph" w:styleId="En-tteetpieddepage">
-    <w:name w:val="En-tête et pied de page"/>
-    <w:basedOn w:val="Normal"/>
-    <w:qFormat/>
-    <w:pPr/>
-    <w:rPr/>
-  </w:style>
   <w:style w:type="paragraph" w:styleId="Header">
     <w:name w:val="header"/>
-    <w:basedOn w:val="En-tteetpieddepageuser"/>
+    <w:basedOn w:val="En-tteetpieddepage"/>
     <w:pPr/>
     <w:rPr/>
   </w:style>
   <w:style w:type="paragraph" w:styleId="Footer">
     <w:name w:val="footer"/>
-    <w:basedOn w:val="En-tteetpieddepageuser"/>
+    <w:basedOn w:val="En-tteetpieddepage"/>
     <w:pPr/>
     <w:rPr/>
   </w:style>

</xml_diff>